<commit_message>
Update NFS1218_Awesome Group Week 1 Discussion (1)(1).docx
</commit_message>
<xml_diff>
--- a/NFS1218_Awesome Group Week 1 Discussion (1)(1).docx
+++ b/NFS1218_Awesome Group Week 1 Discussion (1)(1).docx
@@ -6214,6 +6214,115 @@
           <w:bCs/>
         </w:rPr>
         <w:t>Clustering Validation</w:t>
+      </w:r>
+    </w:p>
+    <w:p>
+      <w:pPr>
+        <w:pStyle w:val="ListParagraph"/>
+        <w:rPr>
+          <w:b/>
+          <w:bCs/>
+        </w:rPr>
+      </w:pPr>
+      <w:r>
+        <w:rPr>
+          <w:b/>
+          <w:bCs/>
+        </w:rPr>
+        <w:drawing>
+          <wp:inline distT="0" distB="0" distL="0" distR="0" wp14:anchorId="57EB31DA" wp14:editId="74E45BFF">
+            <wp:extent cx="5800767" cy="3943379"/>
+            <wp:effectExtent l="0" t="0" r="0" b="0"/>
+            <wp:docPr id="512484222" name="Picture 1"/>
+            <wp:cNvGraphicFramePr>
+              <a:graphicFrameLocks xmlns:a="http://schemas.openxmlformats.org/drawingml/2006/main" noChangeAspect="1"/>
+            </wp:cNvGraphicFramePr>
+            <a:graphic xmlns:a="http://schemas.openxmlformats.org/drawingml/2006/main">
+              <a:graphicData uri="http://schemas.openxmlformats.org/drawingml/2006/picture">
+                <pic:pic xmlns:pic="http://schemas.openxmlformats.org/drawingml/2006/picture">
+                  <pic:nvPicPr>
+                    <pic:cNvPr id="512484222" name=""/>
+                    <pic:cNvPicPr/>
+                  </pic:nvPicPr>
+                  <pic:blipFill>
+                    <a:blip r:embed="rId21"/>
+                    <a:stretch>
+                      <a:fillRect/>
+                    </a:stretch>
+                  </pic:blipFill>
+                  <pic:spPr>
+                    <a:xfrm>
+                      <a:off x="0" y="0"/>
+                      <a:ext cx="5800767" cy="3943379"/>
+                    </a:xfrm>
+                    <a:prstGeom prst="rect">
+                      <a:avLst/>
+                    </a:prstGeom>
+                  </pic:spPr>
+                </pic:pic>
+              </a:graphicData>
+            </a:graphic>
+          </wp:inline>
+        </w:drawing>
+      </w:r>
+    </w:p>
+    <w:p>
+      <w:pPr>
+        <w:pStyle w:val="ListParagraph"/>
+        <w:rPr>
+          <w:b/>
+          <w:bCs/>
+        </w:rPr>
+      </w:pPr>
+    </w:p>
+    <w:p>
+      <w:pPr>
+        <w:pStyle w:val="ListParagraph"/>
+        <w:rPr>
+          <w:b/>
+          <w:bCs/>
+        </w:rPr>
+      </w:pPr>
+      <w:r>
+        <w:rPr>
+          <w:b/>
+          <w:bCs/>
+        </w:rPr>
+        <w:drawing>
+          <wp:inline distT="0" distB="0" distL="0" distR="0" wp14:anchorId="2639B11A" wp14:editId="6FD85D2C">
+            <wp:extent cx="4610739" cy="1385887"/>
+            <wp:effectExtent l="0" t="0" r="0" b="5080"/>
+            <wp:docPr id="1021257961" name="Picture 1"/>
+            <wp:cNvGraphicFramePr>
+              <a:graphicFrameLocks xmlns:a="http://schemas.openxmlformats.org/drawingml/2006/main" noChangeAspect="1"/>
+            </wp:cNvGraphicFramePr>
+            <a:graphic xmlns:a="http://schemas.openxmlformats.org/drawingml/2006/main">
+              <a:graphicData uri="http://schemas.openxmlformats.org/drawingml/2006/picture">
+                <pic:pic xmlns:pic="http://schemas.openxmlformats.org/drawingml/2006/picture">
+                  <pic:nvPicPr>
+                    <pic:cNvPr id="1021257961" name=""/>
+                    <pic:cNvPicPr/>
+                  </pic:nvPicPr>
+                  <pic:blipFill>
+                    <a:blip r:embed="rId22"/>
+                    <a:stretch>
+                      <a:fillRect/>
+                    </a:stretch>
+                  </pic:blipFill>
+                  <pic:spPr>
+                    <a:xfrm>
+                      <a:off x="0" y="0"/>
+                      <a:ext cx="4617301" cy="1387859"/>
+                    </a:xfrm>
+                    <a:prstGeom prst="rect">
+                      <a:avLst/>
+                    </a:prstGeom>
+                  </pic:spPr>
+                </pic:pic>
+              </a:graphicData>
+            </a:graphic>
+          </wp:inline>
+        </w:drawing>
       </w:r>
     </w:p>
     <w:sectPr>
@@ -9527,6 +9636,15 @@
 </file>
 
 <file path=customXml/item1.xml><?xml version="1.0" encoding="utf-8"?>
+<?mso-contentType ?>
+<FormTemplates xmlns="http://schemas.microsoft.com/sharepoint/v3/contenttype/forms">
+  <Display>DocumentLibraryForm</Display>
+  <Edit>DocumentLibraryForm</Edit>
+  <New>DocumentLibraryForm</New>
+</FormTemplates>
+</file>
+
+<file path=customXml/item2.xml><?xml version="1.0" encoding="utf-8"?>
 <ct:contentTypeSchema xmlns:ct="http://schemas.microsoft.com/office/2006/metadata/contentType" xmlns:ma="http://schemas.microsoft.com/office/2006/metadata/properties/metaAttributes" ct:_="" ma:_="" ma:contentTypeName="Document" ma:contentTypeID="0x0101003F364FF36369794CAC5C6BDD61B0EFFD" ma:contentTypeVersion="16" ma:contentTypeDescription="Create a new document." ma:contentTypeScope="" ma:versionID="00875fab896443cdcd5f6e633c28b97a">
   <xsd:schema xmlns:xsd="http://www.w3.org/2001/XMLSchema" xmlns:xs="http://www.w3.org/2001/XMLSchema" xmlns:p="http://schemas.microsoft.com/office/2006/metadata/properties" xmlns:ns3="08107eb9-8dd7-4113-9c47-bd5d852d32e8" xmlns:ns4="b2160066-3763-4ad0-938f-cec1df8b7a04" targetNamespace="http://schemas.microsoft.com/office/2006/metadata/properties" ma:root="true" ma:fieldsID="d265731cbe629211e95a43b65bcd6d59" ns3:_="" ns4:_="">
     <xsd:import namespace="08107eb9-8dd7-4113-9c47-bd5d852d32e8"/>
@@ -9767,15 +9885,6 @@
 </ct:contentTypeSchema>
 </file>
 
-<file path=customXml/item2.xml><?xml version="1.0" encoding="utf-8"?>
-<?mso-contentType ?>
-<FormTemplates xmlns="http://schemas.microsoft.com/sharepoint/v3/contenttype/forms">
-  <Display>DocumentLibraryForm</Display>
-  <Edit>DocumentLibraryForm</Edit>
-  <New>DocumentLibraryForm</New>
-</FormTemplates>
-</file>
-
 <file path=customXml/item3.xml><?xml version="1.0" encoding="utf-8"?>
 <p:properties xmlns:p="http://schemas.microsoft.com/office/2006/metadata/properties" xmlns:xsi="http://www.w3.org/2001/XMLSchema-instance" xmlns:pc="http://schemas.microsoft.com/office/infopath/2007/PartnerControls">
   <documentManagement>
@@ -9785,6 +9894,14 @@
 </file>
 
 <file path=customXml/itemProps1.xml><?xml version="1.0" encoding="utf-8"?>
+<ds:datastoreItem xmlns:ds="http://schemas.openxmlformats.org/officeDocument/2006/customXml" ds:itemID="{D4BFEF51-5E51-4BDB-AA23-DEC56A645723}">
+  <ds:schemaRefs>
+    <ds:schemaRef ds:uri="http://schemas.microsoft.com/sharepoint/v3/contenttype/forms"/>
+  </ds:schemaRefs>
+</ds:datastoreItem>
+</file>
+
+<file path=customXml/itemProps2.xml><?xml version="1.0" encoding="utf-8"?>
 <ds:datastoreItem xmlns:ds="http://schemas.openxmlformats.org/officeDocument/2006/customXml" ds:itemID="{2140C58E-5075-40AA-9EED-CC64D71B2757}">
   <ds:schemaRefs>
     <ds:schemaRef ds:uri="http://schemas.microsoft.com/office/2006/metadata/contentType"/>
@@ -9803,14 +9920,6 @@
 </ds:datastoreItem>
 </file>
 
-<file path=customXml/itemProps2.xml><?xml version="1.0" encoding="utf-8"?>
-<ds:datastoreItem xmlns:ds="http://schemas.openxmlformats.org/officeDocument/2006/customXml" ds:itemID="{D4BFEF51-5E51-4BDB-AA23-DEC56A645723}">
-  <ds:schemaRefs>
-    <ds:schemaRef ds:uri="http://schemas.microsoft.com/sharepoint/v3/contenttype/forms"/>
-  </ds:schemaRefs>
-</ds:datastoreItem>
-</file>
-
 <file path=customXml/itemProps3.xml><?xml version="1.0" encoding="utf-8"?>
 <ds:datastoreItem xmlns:ds="http://schemas.openxmlformats.org/officeDocument/2006/customXml" ds:itemID="{011479DB-9151-4612-A58B-21A4267A484B}">
   <ds:schemaRefs>

</xml_diff>